<commit_message>
Complete battle requirement implementation
</commit_message>
<xml_diff>
--- a/docs/功能需求.docx
+++ b/docs/功能需求.docx
@@ -1271,6 +1271,7 @@
     <w:p>
       <w:pPr>
         <w:numPr>
+          <w:ilvl w:val="0"/>
           <w:numId w:val="0"/>
         </w:numPr>
         <w:ind w:leftChars="0"/>
@@ -1294,6 +1295,7 @@
     <w:p>
       <w:pPr>
         <w:numPr>
+          <w:ilvl w:val="0"/>
           <w:numId w:val="0"/>
         </w:numPr>
         <w:ind w:leftChars="0"/>
@@ -1317,6 +1319,7 @@
     <w:p>
       <w:pPr>
         <w:numPr>
+          <w:ilvl w:val="0"/>
           <w:numId w:val="0"/>
         </w:numPr>
         <w:ind w:leftChars="0"/>
@@ -1340,6 +1343,7 @@
     <w:p>
       <w:pPr>
         <w:numPr>
+          <w:ilvl w:val="0"/>
           <w:numId w:val="0"/>
         </w:numPr>
         <w:ind w:leftChars="0"/>
@@ -1363,6 +1367,7 @@
     <w:p>
       <w:pPr>
         <w:numPr>
+          <w:ilvl w:val="0"/>
           <w:numId w:val="0"/>
         </w:numPr>
         <w:ind w:leftChars="0"/>
@@ -1386,6 +1391,7 @@
     <w:p>
       <w:pPr>
         <w:numPr>
+          <w:ilvl w:val="0"/>
           <w:numId w:val="0"/>
         </w:numPr>
         <w:ind w:leftChars="0"/>
@@ -1409,6 +1415,7 @@
     <w:p>
       <w:pPr>
         <w:numPr>
+          <w:ilvl w:val="0"/>
           <w:numId w:val="0"/>
         </w:numPr>
         <w:ind w:leftChars="0"/>
@@ -1432,6 +1439,7 @@
     <w:p>
       <w:pPr>
         <w:numPr>
+          <w:ilvl w:val="0"/>
           <w:numId w:val="0"/>
         </w:numPr>
         <w:ind w:leftChars="0"/>
@@ -1455,6 +1463,7 @@
     <w:p>
       <w:pPr>
         <w:numPr>
+          <w:ilvl w:val="0"/>
           <w:numId w:val="0"/>
         </w:numPr>
         <w:ind w:leftChars="0"/>
@@ -1478,6 +1487,7 @@
     <w:p>
       <w:pPr>
         <w:numPr>
+          <w:ilvl w:val="0"/>
           <w:numId w:val="0"/>
         </w:numPr>
         <w:ind w:leftChars="0"/>
@@ -1501,6 +1511,7 @@
     <w:p>
       <w:pPr>
         <w:numPr>
+          <w:ilvl w:val="0"/>
           <w:numId w:val="0"/>
         </w:numPr>
         <w:ind w:leftChars="0"/>
@@ -1519,32 +1530,733 @@
           <w:lang w:val="en-US" w:eastAsia="zh-CN"/>
         </w:rPr>
         <w:t>波次倒计时：以倒计时形式显示当前波次剩余时间</w:t>
+      </w:r>
+    </w:p>
+    <w:p>
+      <w:pPr>
+        <w:numPr>
+          <w:ilvl w:val="0"/>
+          <w:numId w:val="0"/>
+        </w:numPr>
+        <w:ind w:leftChars="0"/>
+        <w:rPr>
+          <w:rFonts w:hint="eastAsia"/>
+          <w:b w:val="0"/>
+          <w:bCs w:val="0"/>
+          <w:lang w:val="en-US" w:eastAsia="zh-CN"/>
+        </w:rPr>
+      </w:pPr>
+      <w:r>
+        <w:rPr>
+          <w:rFonts w:hint="eastAsia"/>
+          <w:b w:val="0"/>
+          <w:bCs w:val="0"/>
+          <w:lang w:val="en-US" w:eastAsia="zh-CN"/>
+        </w:rPr>
+        <w:t>通关：当前波次数与总波次数相同且波次倒计时结束后所有怪物都被消灭，弹出战斗胜利字样，5秒后关闭战斗界面至选关界面</w:t>
+      </w:r>
+    </w:p>
+    <w:p>
+      <w:pPr>
+        <w:numPr>
+          <w:ilvl w:val="0"/>
+          <w:numId w:val="0"/>
+        </w:numPr>
+        <w:ind w:leftChars="0"/>
+        <w:rPr>
+          <w:rFonts w:hint="eastAsia"/>
+          <w:b w:val="0"/>
+          <w:bCs w:val="0"/>
+          <w:lang w:val="en-US" w:eastAsia="zh-CN"/>
+        </w:rPr>
+      </w:pPr>
+    </w:p>
+    <w:p>
+      <w:pPr>
+        <w:numPr>
+          <w:ilvl w:val="0"/>
+          <w:numId w:val="0"/>
+        </w:numPr>
+        <w:ind w:leftChars="0"/>
+        <w:rPr>
+          <w:rFonts w:hint="eastAsia"/>
+          <w:b w:val="0"/>
+          <w:bCs w:val="0"/>
+          <w:lang w:val="en-US" w:eastAsia="zh-CN"/>
+        </w:rPr>
+      </w:pPr>
+    </w:p>
+    <w:p>
+      <w:pPr>
+        <w:numPr>
+          <w:ilvl w:val="0"/>
+          <w:numId w:val="0"/>
+        </w:numPr>
+        <w:ind w:leftChars="0"/>
+        <w:rPr>
+          <w:rFonts w:hint="eastAsia"/>
+          <w:b w:val="0"/>
+          <w:bCs w:val="0"/>
+          <w:lang w:val="en-US" w:eastAsia="zh-CN"/>
+        </w:rPr>
+      </w:pPr>
+    </w:p>
+    <w:p>
+      <w:pPr>
+        <w:numPr>
+          <w:ilvl w:val="0"/>
+          <w:numId w:val="0"/>
+        </w:numPr>
+        <w:ind w:leftChars="0"/>
+        <w:rPr>
+          <w:rFonts w:hint="eastAsia"/>
+          <w:b w:val="0"/>
+          <w:bCs w:val="0"/>
+          <w:lang w:val="en-US" w:eastAsia="zh-CN"/>
+        </w:rPr>
+      </w:pPr>
+    </w:p>
+    <w:p>
+      <w:pPr>
+        <w:numPr>
+          <w:ilvl w:val="0"/>
+          <w:numId w:val="0"/>
+        </w:numPr>
+        <w:ind w:leftChars="0"/>
+        <w:rPr>
+          <w:rFonts w:hint="eastAsia"/>
+          <w:b w:val="0"/>
+          <w:bCs w:val="0"/>
+          <w:lang w:val="en-US" w:eastAsia="zh-CN"/>
+        </w:rPr>
+      </w:pPr>
+    </w:p>
+    <w:p>
+      <w:pPr>
+        <w:numPr>
+          <w:ilvl w:val="0"/>
+          <w:numId w:val="0"/>
+        </w:numPr>
+        <w:ind w:leftChars="0"/>
+        <w:rPr>
+          <w:rFonts w:hint="eastAsia"/>
+          <w:b w:val="0"/>
+          <w:bCs w:val="0"/>
+          <w:lang w:val="en-US" w:eastAsia="zh-CN"/>
+        </w:rPr>
+      </w:pPr>
+    </w:p>
+    <w:p>
+      <w:pPr>
+        <w:numPr>
+          <w:ilvl w:val="0"/>
+          <w:numId w:val="0"/>
+        </w:numPr>
+        <w:ind w:leftChars="0"/>
+        <w:rPr>
+          <w:rFonts w:hint="eastAsia"/>
+          <w:b w:val="0"/>
+          <w:bCs w:val="0"/>
+          <w:lang w:val="en-US" w:eastAsia="zh-CN"/>
+        </w:rPr>
+      </w:pPr>
+    </w:p>
+    <w:p>
+      <w:pPr>
+        <w:numPr>
+          <w:ilvl w:val="0"/>
+          <w:numId w:val="0"/>
+        </w:numPr>
+        <w:ind w:leftChars="0"/>
+        <w:rPr>
+          <w:rFonts w:hint="eastAsia"/>
+          <w:b w:val="0"/>
+          <w:bCs w:val="0"/>
+          <w:lang w:val="en-US" w:eastAsia="zh-CN"/>
+        </w:rPr>
+      </w:pPr>
+    </w:p>
+    <w:p>
+      <w:pPr>
+        <w:numPr>
+          <w:ilvl w:val="0"/>
+          <w:numId w:val="0"/>
+        </w:numPr>
+        <w:ind w:leftChars="0"/>
+        <w:rPr>
+          <w:rFonts w:hint="eastAsia"/>
+          <w:b w:val="0"/>
+          <w:bCs w:val="0"/>
+          <w:lang w:val="en-US" w:eastAsia="zh-CN"/>
+        </w:rPr>
+      </w:pPr>
+    </w:p>
+    <w:p>
+      <w:pPr>
+        <w:numPr>
+          <w:ilvl w:val="0"/>
+          <w:numId w:val="0"/>
+        </w:numPr>
+        <w:ind w:leftChars="0"/>
+        <w:rPr>
+          <w:rFonts w:hint="default"/>
+          <w:b w:val="0"/>
+          <w:bCs w:val="0"/>
+          <w:lang w:val="en-US" w:eastAsia="zh-CN"/>
+        </w:rPr>
+      </w:pPr>
+      <w:r>
+        <w:rPr>
+          <w:rFonts w:hint="eastAsia"/>
+          <w:b w:val="0"/>
+          <w:bCs w:val="0"/>
+          <w:lang w:val="en-US" w:eastAsia="zh-CN"/>
+        </w:rPr>
+        <w:t>战斗界面示意图</w:t>
+      </w:r>
+    </w:p>
+    <w:p>
+      <w:pPr>
+        <w:numPr>
+          <w:ilvl w:val="0"/>
+          <w:numId w:val="0"/>
+        </w:numPr>
+        <w:ind w:leftChars="0"/>
+        <w:rPr>
+          <w:rFonts w:hint="default"/>
+          <w:b w:val="0"/>
+          <w:bCs w:val="0"/>
+          <w:lang w:val="en-US" w:eastAsia="zh-CN"/>
+        </w:rPr>
+      </w:pPr>
+      <w:r>
+        <w:rPr>
+          <w:rFonts w:hint="default"/>
+          <w:b w:val="0"/>
+          <w:bCs w:val="0"/>
+          <w:lang w:val="en-US" w:eastAsia="zh-CN"/>
+        </w:rPr>
+        <w:drawing>
+          <wp:inline distT="0" distB="0" distL="114300" distR="114300">
+            <wp:extent cx="5257800" cy="2844165"/>
+            <wp:effectExtent l="0" t="0" r="0" b="635"/>
+            <wp:docPr id="13" name="图片 2"/>
+            <wp:cNvGraphicFramePr>
+              <a:graphicFrameLocks xmlns:a="http://schemas.openxmlformats.org/drawingml/2006/main" noChangeAspect="1"/>
+            </wp:cNvGraphicFramePr>
+            <a:graphic xmlns:a="http://schemas.openxmlformats.org/drawingml/2006/main">
+              <a:graphicData uri="http://schemas.openxmlformats.org/drawingml/2006/picture">
+                <pic:pic xmlns:pic="http://schemas.openxmlformats.org/drawingml/2006/picture">
+                  <pic:nvPicPr>
+                    <pic:cNvPr id="13" name="图片 2"/>
+                    <pic:cNvPicPr>
+                      <a:picLocks noChangeAspect="1"/>
+                    </pic:cNvPicPr>
+                  </pic:nvPicPr>
+                  <pic:blipFill>
+                    <a:blip r:embed="rId15"/>
+                    <a:stretch>
+                      <a:fillRect/>
+                    </a:stretch>
+                  </pic:blipFill>
+                  <pic:spPr>
+                    <a:xfrm>
+                      <a:off x="0" y="0"/>
+                      <a:ext cx="5257800" cy="2844165"/>
+                    </a:xfrm>
+                    <a:prstGeom prst="rect">
+                      <a:avLst/>
+                    </a:prstGeom>
+                    <a:noFill/>
+                    <a:ln>
+                      <a:noFill/>
+                    </a:ln>
+                  </pic:spPr>
+                </pic:pic>
+              </a:graphicData>
+            </a:graphic>
+          </wp:inline>
+        </w:drawing>
+      </w:r>
+    </w:p>
+    <w:p>
+      <w:pPr>
+        <w:numPr>
+          <w:ilvl w:val="0"/>
+          <w:numId w:val="4"/>
+        </w:numPr>
+        <w:ind w:leftChars="0"/>
+        <w:rPr>
+          <w:rFonts w:hint="eastAsia"/>
+          <w:b w:val="0"/>
+          <w:bCs w:val="0"/>
+          <w:lang w:val="en-US" w:eastAsia="zh-CN"/>
+        </w:rPr>
+      </w:pPr>
+      <w:r>
+        <w:rPr>
+          <w:rFonts w:hint="eastAsia"/>
+          <w:b w:val="0"/>
+          <w:bCs w:val="0"/>
+          <w:lang w:val="en-US" w:eastAsia="zh-CN"/>
+        </w:rPr>
+        <w:t>手中零件不能组装出某一建筑时，该建筑图标置灰，若能，建筑图标置亮</w:t>
+      </w:r>
+    </w:p>
+    <w:p>
+      <w:pPr>
+        <w:numPr>
+          <w:ilvl w:val="0"/>
+          <w:numId w:val="4"/>
+        </w:numPr>
+        <w:ind w:leftChars="0"/>
+        <w:rPr>
+          <w:rFonts w:hint="default"/>
+          <w:b w:val="0"/>
+          <w:bCs w:val="0"/>
+          <w:lang w:val="en-US" w:eastAsia="zh-CN"/>
+        </w:rPr>
+      </w:pPr>
+      <w:r>
+        <w:rPr>
+          <w:rFonts w:hint="eastAsia"/>
+          <w:b w:val="0"/>
+          <w:bCs w:val="0"/>
+          <w:lang w:val="en-US" w:eastAsia="zh-CN"/>
+        </w:rPr>
+        <w:t>wasd或鼠标拖动可移动视角</w:t>
+      </w:r>
+    </w:p>
+    <w:p>
+      <w:pPr>
+        <w:numPr>
+          <w:ilvl w:val="0"/>
+          <w:numId w:val="4"/>
+        </w:numPr>
+        <w:ind w:leftChars="0"/>
+        <w:rPr>
+          <w:rFonts w:hint="default"/>
+          <w:b w:val="0"/>
+          <w:bCs w:val="0"/>
+          <w:lang w:val="en-US" w:eastAsia="zh-CN"/>
+        </w:rPr>
+      </w:pPr>
+      <w:r>
+        <w:rPr>
+          <w:rFonts w:hint="eastAsia"/>
+          <w:b w:val="0"/>
+          <w:bCs w:val="0"/>
+          <w:lang w:val="en-US" w:eastAsia="zh-CN"/>
+        </w:rPr>
+        <w:t>当前拥有的金币不够购买某商品时，该商品图标置灰，若足够，商品图标置亮</w:t>
+      </w:r>
+    </w:p>
+    <w:p>
+      <w:pPr>
+        <w:numPr>
+          <w:ilvl w:val="0"/>
+          <w:numId w:val="4"/>
+        </w:numPr>
+        <w:ind w:leftChars="0"/>
+        <w:rPr>
+          <w:rFonts w:hint="default"/>
+          <w:b w:val="0"/>
+          <w:bCs w:val="0"/>
+          <w:lang w:val="en-US" w:eastAsia="zh-CN"/>
+        </w:rPr>
+      </w:pPr>
+      <w:r>
+        <w:rPr>
+          <w:rFonts w:hint="eastAsia"/>
+          <w:b w:val="0"/>
+          <w:bCs w:val="0"/>
+          <w:lang w:val="en-US" w:eastAsia="zh-CN"/>
+        </w:rPr>
+        <w:t>拥有玩具盒数量不为0时点击玩具盒图标使用玩具盒，使用效果为获取该玩具盒可开出零件，当前拥有的零件显示在零件图标位置</w:t>
+      </w:r>
+    </w:p>
+    <w:p>
+      <w:pPr>
+        <w:numPr>
+          <w:numId w:val="0"/>
+        </w:numPr>
+        <w:rPr>
+          <w:rFonts w:hint="eastAsia"/>
+          <w:b w:val="0"/>
+          <w:bCs w:val="0"/>
+          <w:lang w:val="en-US" w:eastAsia="zh-CN"/>
+        </w:rPr>
+      </w:pPr>
+    </w:p>
+    <w:p>
+      <w:pPr>
+        <w:numPr>
+          <w:numId w:val="0"/>
+        </w:numPr>
+        <w:rPr>
+          <w:rFonts w:hint="eastAsia"/>
+          <w:b w:val="0"/>
+          <w:bCs w:val="0"/>
+          <w:lang w:val="en-US" w:eastAsia="zh-CN"/>
+        </w:rPr>
+      </w:pPr>
+      <w:r>
+        <w:rPr>
+          <w:rFonts w:hint="eastAsia"/>
+          <w:b w:val="0"/>
+          <w:bCs w:val="0"/>
+          <w:lang w:val="en-US" w:eastAsia="zh-CN"/>
+        </w:rPr>
+        <w:t>商店商品：</w:t>
+      </w:r>
+    </w:p>
+    <w:p>
+      <w:pPr>
+        <w:numPr>
+          <w:ilvl w:val="0"/>
+          <w:numId w:val="5"/>
+        </w:numPr>
+        <w:rPr>
+          <w:rFonts w:hint="eastAsia"/>
+          <w:b w:val="0"/>
+          <w:bCs w:val="0"/>
+          <w:lang w:val="en-US" w:eastAsia="zh-CN"/>
+        </w:rPr>
+      </w:pPr>
+      <w:r>
+        <w:rPr>
+          <w:rFonts w:hint="eastAsia"/>
+          <w:b w:val="0"/>
+          <w:bCs w:val="0"/>
+          <w:lang w:val="en-US" w:eastAsia="zh-CN"/>
+        </w:rPr>
+        <w:t>可搭建建筑数量上限提高1</w:t>
+      </w:r>
+    </w:p>
+    <w:p>
+      <w:pPr>
+        <w:numPr>
+          <w:ilvl w:val="0"/>
+          <w:numId w:val="5"/>
+        </w:numPr>
+        <w:rPr>
+          <w:rFonts w:hint="default"/>
+          <w:b w:val="0"/>
+          <w:bCs w:val="0"/>
+          <w:lang w:val="en-US" w:eastAsia="zh-CN"/>
+        </w:rPr>
+      </w:pPr>
+      <w:r>
+        <w:rPr>
+          <w:rFonts w:hint="eastAsia"/>
+          <w:b w:val="0"/>
+          <w:bCs w:val="0"/>
+          <w:lang w:val="en-US" w:eastAsia="zh-CN"/>
+        </w:rPr>
+        <w:t>当前玩具盒数量加1</w:t>
+      </w:r>
+    </w:p>
+    <w:p>
+      <w:pPr>
+        <w:numPr>
+          <w:ilvl w:val="0"/>
+          <w:numId w:val="5"/>
+        </w:numPr>
+        <w:rPr>
+          <w:rFonts w:hint="default"/>
+          <w:b w:val="0"/>
+          <w:bCs w:val="0"/>
+          <w:lang w:val="en-US" w:eastAsia="zh-CN"/>
+        </w:rPr>
+      </w:pPr>
+      <w:r>
+        <w:rPr>
+          <w:rFonts w:hint="eastAsia"/>
+          <w:b w:val="0"/>
+          <w:bCs w:val="0"/>
+          <w:lang w:val="en-US" w:eastAsia="zh-CN"/>
+        </w:rPr>
+        <w:t>等级加1</w:t>
+      </w:r>
+    </w:p>
+    <w:p>
+      <w:pPr>
+        <w:widowControl w:val="0"/>
+        <w:numPr>
+          <w:numId w:val="0"/>
+        </w:numPr>
+        <w:jc w:val="both"/>
+        <w:rPr>
+          <w:rFonts w:hint="eastAsia"/>
+          <w:b w:val="0"/>
+          <w:bCs w:val="0"/>
+          <w:lang w:val="en-US" w:eastAsia="zh-CN"/>
+        </w:rPr>
+      </w:pPr>
+    </w:p>
+    <w:p>
+      <w:pPr>
+        <w:widowControl w:val="0"/>
+        <w:numPr>
+          <w:numId w:val="0"/>
+        </w:numPr>
+        <w:jc w:val="both"/>
+        <w:rPr>
+          <w:rFonts w:hint="eastAsia"/>
+          <w:b w:val="0"/>
+          <w:bCs w:val="0"/>
+          <w:lang w:val="en-US" w:eastAsia="zh-CN"/>
+        </w:rPr>
+      </w:pPr>
+      <w:r>
+        <w:rPr>
+          <w:rFonts w:hint="eastAsia"/>
+          <w:b w:val="0"/>
+          <w:bCs w:val="0"/>
+          <w:lang w:val="en-US" w:eastAsia="zh-CN"/>
+        </w:rPr>
+        <w:t>搭建建筑机制：</w:t>
+      </w:r>
+    </w:p>
+    <w:p>
+      <w:pPr>
+        <w:widowControl w:val="0"/>
+        <w:numPr>
+          <w:numId w:val="0"/>
+        </w:numPr>
+        <w:jc w:val="both"/>
+        <w:rPr>
+          <w:rFonts w:hint="default"/>
+          <w:b w:val="0"/>
+          <w:bCs w:val="0"/>
+          <w:lang w:val="en-US" w:eastAsia="zh-CN"/>
+        </w:rPr>
+      </w:pPr>
+      <w:r>
+        <w:rPr>
+          <w:rFonts w:hint="eastAsia"/>
+          <w:b w:val="0"/>
+          <w:bCs w:val="0"/>
+          <w:lang w:val="en-US" w:eastAsia="zh-CN"/>
+        </w:rPr>
+        <w:t>拥有对应图纸所需零件后，点击选中战斗界面对应建筑图标，再点击战斗场地任一位置可搭建建筑，当建筑数量达上限后无法进行搭建，表现为无法选中建筑图标</w:t>
+      </w:r>
+    </w:p>
+    <w:p>
+      <w:pPr>
+        <w:widowControl w:val="0"/>
+        <w:numPr>
+          <w:numId w:val="0"/>
+        </w:numPr>
+        <w:jc w:val="both"/>
+        <w:rPr>
+          <w:rFonts w:hint="eastAsia"/>
+          <w:b w:val="0"/>
+          <w:bCs w:val="0"/>
+          <w:lang w:val="en-US" w:eastAsia="zh-CN"/>
+        </w:rPr>
+      </w:pPr>
+    </w:p>
+    <w:p>
+      <w:pPr>
+        <w:widowControl w:val="0"/>
+        <w:numPr>
+          <w:numId w:val="0"/>
+        </w:numPr>
+        <w:jc w:val="both"/>
+        <w:rPr>
+          <w:rFonts w:hint="eastAsia"/>
+          <w:b w:val="0"/>
+          <w:bCs w:val="0"/>
+          <w:lang w:val="en-US" w:eastAsia="zh-CN"/>
+        </w:rPr>
+      </w:pPr>
+      <w:r>
+        <w:rPr>
+          <w:rFonts w:hint="eastAsia"/>
+          <w:b w:val="0"/>
+          <w:bCs w:val="0"/>
+          <w:lang w:val="en-US" w:eastAsia="zh-CN"/>
+        </w:rPr>
+        <w:t>建筑升级机制：</w:t>
+      </w:r>
+    </w:p>
+    <w:p>
+      <w:pPr>
+        <w:widowControl w:val="0"/>
+        <w:numPr>
+          <w:numId w:val="0"/>
+        </w:numPr>
+        <w:jc w:val="both"/>
+        <w:rPr>
+          <w:rFonts w:hint="eastAsia"/>
+          <w:b w:val="0"/>
+          <w:bCs w:val="0"/>
+          <w:lang w:val="en-US" w:eastAsia="zh-CN"/>
+        </w:rPr>
+      </w:pPr>
+      <w:r>
+        <w:rPr>
+          <w:rFonts w:hint="eastAsia"/>
+          <w:b w:val="0"/>
+          <w:bCs w:val="0"/>
+          <w:lang w:val="en-US" w:eastAsia="zh-CN"/>
+        </w:rPr>
+        <w:t>使用零件组装出建筑后，拖动零件至建筑上可消耗零件升级建筑，不同零件有不同升级效果，升级1次建筑视为原有等级加1，建筑等级不能超过现等级上限，商店购买等级可提升等级</w:t>
+      </w:r>
+    </w:p>
+    <w:p>
+      <w:pPr>
+        <w:widowControl w:val="0"/>
+        <w:numPr>
+          <w:numId w:val="0"/>
+        </w:numPr>
+        <w:jc w:val="both"/>
+        <w:rPr>
+          <w:rFonts w:hint="eastAsia"/>
+          <w:b w:val="0"/>
+          <w:bCs w:val="0"/>
+          <w:lang w:val="en-US" w:eastAsia="zh-CN"/>
+        </w:rPr>
+      </w:pPr>
+    </w:p>
+    <w:p>
+      <w:pPr>
+        <w:widowControl w:val="0"/>
+        <w:numPr>
+          <w:numId w:val="0"/>
+        </w:numPr>
+        <w:jc w:val="both"/>
+        <w:rPr>
+          <w:rFonts w:hint="eastAsia"/>
+          <w:b w:val="0"/>
+          <w:bCs w:val="0"/>
+          <w:lang w:val="en-US" w:eastAsia="zh-CN"/>
+        </w:rPr>
+      </w:pPr>
+      <w:r>
+        <w:rPr>
+          <w:rFonts w:hint="eastAsia"/>
+          <w:b w:val="0"/>
+          <w:bCs w:val="0"/>
+          <w:lang w:val="en-US" w:eastAsia="zh-CN"/>
+        </w:rPr>
+        <w:t>场地中建筑详情：</w:t>
+      </w:r>
+    </w:p>
+    <w:p>
+      <w:pPr>
+        <w:widowControl w:val="0"/>
+        <w:numPr>
+          <w:numId w:val="0"/>
+        </w:numPr>
+        <w:jc w:val="both"/>
+        <w:rPr>
+          <w:rFonts w:hint="eastAsia"/>
+          <w:b w:val="0"/>
+          <w:bCs w:val="0"/>
+          <w:lang w:val="en-US" w:eastAsia="zh-CN"/>
+        </w:rPr>
+      </w:pPr>
+      <w:r>
+        <w:rPr>
+          <w:rFonts w:hint="eastAsia"/>
+          <w:b w:val="0"/>
+          <w:bCs w:val="0"/>
+          <w:lang w:val="en-US" w:eastAsia="zh-CN"/>
+        </w:rPr>
+        <w:t>点击建筑可显示出对应建筑信息，界面如下：</w:t>
+      </w:r>
+    </w:p>
+    <w:p>
+      <w:pPr>
+        <w:widowControl w:val="0"/>
+        <w:numPr>
+          <w:numId w:val="0"/>
+        </w:numPr>
+        <w:jc w:val="both"/>
+        <w:rPr>
+          <w:rFonts w:hint="default"/>
+          <w:b w:val="0"/>
+          <w:bCs w:val="0"/>
+          <w:lang w:val="en-US" w:eastAsia="zh-CN"/>
+        </w:rPr>
+      </w:pPr>
+      <w:r>
+        <w:rPr>
+          <w:rFonts w:hint="default"/>
+          <w:b w:val="0"/>
+          <w:bCs w:val="0"/>
+          <w:lang w:val="en-US" w:eastAsia="zh-CN"/>
+        </w:rPr>
+        <w:drawing>
+          <wp:inline distT="0" distB="0" distL="114300" distR="114300">
+            <wp:extent cx="1677035" cy="1414145"/>
+            <wp:effectExtent l="0" t="0" r="12065" b="8255"/>
+            <wp:docPr id="14" name="图片 3"/>
+            <wp:cNvGraphicFramePr>
+              <a:graphicFrameLocks xmlns:a="http://schemas.openxmlformats.org/drawingml/2006/main" noChangeAspect="1"/>
+            </wp:cNvGraphicFramePr>
+            <a:graphic xmlns:a="http://schemas.openxmlformats.org/drawingml/2006/main">
+              <a:graphicData uri="http://schemas.openxmlformats.org/drawingml/2006/picture">
+                <pic:pic xmlns:pic="http://schemas.openxmlformats.org/drawingml/2006/picture">
+                  <pic:nvPicPr>
+                    <pic:cNvPr id="14" name="图片 3"/>
+                    <pic:cNvPicPr>
+                      <a:picLocks noChangeAspect="1"/>
+                    </pic:cNvPicPr>
+                  </pic:nvPicPr>
+                  <pic:blipFill>
+                    <a:blip r:embed="rId16"/>
+                    <a:stretch>
+                      <a:fillRect/>
+                    </a:stretch>
+                  </pic:blipFill>
+                  <pic:spPr>
+                    <a:xfrm>
+                      <a:off x="0" y="0"/>
+                      <a:ext cx="1677035" cy="1414145"/>
+                    </a:xfrm>
+                    <a:prstGeom prst="rect">
+                      <a:avLst/>
+                    </a:prstGeom>
+                    <a:noFill/>
+                    <a:ln>
+                      <a:noFill/>
+                    </a:ln>
+                  </pic:spPr>
+                </pic:pic>
+              </a:graphicData>
+            </a:graphic>
+          </wp:inline>
+        </w:drawing>
+      </w:r>
+    </w:p>
+    <w:p>
+      <w:pPr>
+        <w:widowControl w:val="0"/>
+        <w:numPr>
+          <w:numId w:val="0"/>
+        </w:numPr>
+        <w:jc w:val="both"/>
+        <w:rPr>
+          <w:rFonts w:hint="default"/>
+          <w:b w:val="0"/>
+          <w:bCs w:val="0"/>
+          <w:lang w:val="en-US" w:eastAsia="zh-CN"/>
+        </w:rPr>
+      </w:pPr>
+      <w:r>
+        <w:rPr>
+          <w:rFonts w:hint="eastAsia"/>
+          <w:b w:val="0"/>
+          <w:bCs w:val="0"/>
+          <w:lang w:val="en-US" w:eastAsia="zh-CN"/>
+        </w:rPr>
+        <w:t>出售建筑可回收组建建筑使用的零件，无法获得升级建筑使用的零件</w:t>
       </w:r>
       <w:bookmarkStart w:id="0" w:name="_GoBack"/>
       <w:bookmarkEnd w:id="0"/>
-    </w:p>
-    <w:p>
-      <w:pPr>
-        <w:numPr>
-          <w:numId w:val="0"/>
-        </w:numPr>
-        <w:ind w:leftChars="0"/>
-        <w:rPr>
-          <w:rFonts w:hint="default"/>
-          <w:b w:val="0"/>
-          <w:bCs w:val="0"/>
-          <w:lang w:val="en-US" w:eastAsia="zh-CN"/>
-        </w:rPr>
-      </w:pPr>
-      <w:r>
-        <w:rPr>
-          <w:rFonts w:hint="eastAsia"/>
-          <w:b w:val="0"/>
-          <w:bCs w:val="0"/>
-          <w:lang w:val="en-US" w:eastAsia="zh-CN"/>
-        </w:rPr>
-        <w:t>通关：当前波次数与总波次数相同且波次倒计时结束后所有怪物都被消灭，弹出战斗胜利字样，5秒后关闭战斗界面至选关界面</w:t>
-      </w:r>
     </w:p>
     <w:sectPr>
       <w:pgSz w:w="11906" w:h="16838"/>
@@ -1575,6 +2287,22 @@
     </w:lvl>
   </w:abstractNum>
   <w:abstractNum w:abstractNumId="1">
+    <w:nsid w:val="13A220A1"/>
+    <w:multiLevelType w:val="singleLevel"/>
+    <w:tmpl w:val="13A220A1"/>
+    <w:lvl w:ilvl="0" w:tentative="0">
+      <w:start w:val="1"/>
+      <w:numFmt w:val="decimal"/>
+      <w:lvlText w:val="%1."/>
+      <w:lvlJc w:val="left"/>
+      <w:pPr>
+        <w:tabs>
+          <w:tab w:val="left" w:pos="312"/>
+        </w:tabs>
+      </w:pPr>
+    </w:lvl>
+  </w:abstractNum>
+  <w:abstractNum w:abstractNumId="2">
     <w:nsid w:val="1BE64581"/>
     <w:multiLevelType w:val="singleLevel"/>
     <w:tmpl w:val="1BE64581"/>
@@ -1589,7 +2317,23 @@
       </w:rPr>
     </w:lvl>
   </w:abstractNum>
-  <w:abstractNum w:abstractNumId="2">
+  <w:abstractNum w:abstractNumId="3">
+    <w:nsid w:val="4976F58B"/>
+    <w:multiLevelType w:val="singleLevel"/>
+    <w:tmpl w:val="4976F58B"/>
+    <w:lvl w:ilvl="0" w:tentative="0">
+      <w:start w:val="1"/>
+      <w:numFmt w:val="decimal"/>
+      <w:lvlText w:val="%1."/>
+      <w:lvlJc w:val="left"/>
+      <w:pPr>
+        <w:tabs>
+          <w:tab w:val="left" w:pos="312"/>
+        </w:tabs>
+      </w:pPr>
+    </w:lvl>
+  </w:abstractNum>
+  <w:abstractNum w:abstractNumId="4">
     <w:nsid w:val="67B42D84"/>
     <w:multiLevelType w:val="singleLevel"/>
     <w:tmpl w:val="67B42D84"/>
@@ -1606,13 +2350,19 @@
     </w:lvl>
   </w:abstractNum>
   <w:num w:numId="1">
-    <w:abstractNumId w:val="1"/>
+    <w:abstractNumId w:val="2"/>
   </w:num>
   <w:num w:numId="2">
     <w:abstractNumId w:val="0"/>
   </w:num>
   <w:num w:numId="3">
-    <w:abstractNumId w:val="2"/>
+    <w:abstractNumId w:val="4"/>
+  </w:num>
+  <w:num w:numId="4">
+    <w:abstractNumId w:val="3"/>
+  </w:num>
+  <w:num w:numId="5">
+    <w:abstractNumId w:val="1"/>
   </w:num>
 </w:numbering>
 </file>

</xml_diff>

<commit_message>
Update delivered planning docs
</commit_message>
<xml_diff>
--- a/docs/功能需求.docx
+++ b/docs/功能需求.docx
@@ -1271,7 +1271,6 @@
     <w:p>
       <w:pPr>
         <w:numPr>
-          <w:ilvl w:val="0"/>
           <w:numId w:val="0"/>
         </w:numPr>
         <w:ind w:leftChars="0"/>
@@ -1295,7 +1294,6 @@
     <w:p>
       <w:pPr>
         <w:numPr>
-          <w:ilvl w:val="0"/>
           <w:numId w:val="0"/>
         </w:numPr>
         <w:ind w:leftChars="0"/>
@@ -1319,7 +1317,6 @@
     <w:p>
       <w:pPr>
         <w:numPr>
-          <w:ilvl w:val="0"/>
           <w:numId w:val="0"/>
         </w:numPr>
         <w:ind w:leftChars="0"/>
@@ -1343,7 +1340,6 @@
     <w:p>
       <w:pPr>
         <w:numPr>
-          <w:ilvl w:val="0"/>
           <w:numId w:val="0"/>
         </w:numPr>
         <w:ind w:leftChars="0"/>
@@ -1367,7 +1363,6 @@
     <w:p>
       <w:pPr>
         <w:numPr>
-          <w:ilvl w:val="0"/>
           <w:numId w:val="0"/>
         </w:numPr>
         <w:ind w:leftChars="0"/>
@@ -1391,7 +1386,6 @@
     <w:p>
       <w:pPr>
         <w:numPr>
-          <w:ilvl w:val="0"/>
           <w:numId w:val="0"/>
         </w:numPr>
         <w:ind w:leftChars="0"/>
@@ -1415,7 +1409,6 @@
     <w:p>
       <w:pPr>
         <w:numPr>
-          <w:ilvl w:val="0"/>
           <w:numId w:val="0"/>
         </w:numPr>
         <w:ind w:leftChars="0"/>
@@ -1439,7 +1432,6 @@
     <w:p>
       <w:pPr>
         <w:numPr>
-          <w:ilvl w:val="0"/>
           <w:numId w:val="0"/>
         </w:numPr>
         <w:ind w:leftChars="0"/>
@@ -1463,7 +1455,6 @@
     <w:p>
       <w:pPr>
         <w:numPr>
-          <w:ilvl w:val="0"/>
           <w:numId w:val="0"/>
         </w:numPr>
         <w:ind w:leftChars="0"/>
@@ -1487,7 +1478,6 @@
     <w:p>
       <w:pPr>
         <w:numPr>
-          <w:ilvl w:val="0"/>
           <w:numId w:val="0"/>
         </w:numPr>
         <w:ind w:leftChars="0"/>
@@ -1511,7 +1501,6 @@
     <w:p>
       <w:pPr>
         <w:numPr>
-          <w:ilvl w:val="0"/>
           <w:numId w:val="0"/>
         </w:numPr>
         <w:ind w:leftChars="0"/>
@@ -1530,733 +1519,32 @@
           <w:lang w:val="en-US" w:eastAsia="zh-CN"/>
         </w:rPr>
         <w:t>波次倒计时：以倒计时形式显示当前波次剩余时间</w:t>
-      </w:r>
-    </w:p>
-    <w:p>
-      <w:pPr>
-        <w:numPr>
-          <w:ilvl w:val="0"/>
-          <w:numId w:val="0"/>
-        </w:numPr>
-        <w:ind w:leftChars="0"/>
-        <w:rPr>
-          <w:rFonts w:hint="eastAsia"/>
-          <w:b w:val="0"/>
-          <w:bCs w:val="0"/>
-          <w:lang w:val="en-US" w:eastAsia="zh-CN"/>
-        </w:rPr>
-      </w:pPr>
-      <w:r>
-        <w:rPr>
-          <w:rFonts w:hint="eastAsia"/>
-          <w:b w:val="0"/>
-          <w:bCs w:val="0"/>
-          <w:lang w:val="en-US" w:eastAsia="zh-CN"/>
-        </w:rPr>
-        <w:t>通关：当前波次数与总波次数相同且波次倒计时结束后所有怪物都被消灭，弹出战斗胜利字样，5秒后关闭战斗界面至选关界面</w:t>
-      </w:r>
-    </w:p>
-    <w:p>
-      <w:pPr>
-        <w:numPr>
-          <w:ilvl w:val="0"/>
-          <w:numId w:val="0"/>
-        </w:numPr>
-        <w:ind w:leftChars="0"/>
-        <w:rPr>
-          <w:rFonts w:hint="eastAsia"/>
-          <w:b w:val="0"/>
-          <w:bCs w:val="0"/>
-          <w:lang w:val="en-US" w:eastAsia="zh-CN"/>
-        </w:rPr>
-      </w:pPr>
-    </w:p>
-    <w:p>
-      <w:pPr>
-        <w:numPr>
-          <w:ilvl w:val="0"/>
-          <w:numId w:val="0"/>
-        </w:numPr>
-        <w:ind w:leftChars="0"/>
-        <w:rPr>
-          <w:rFonts w:hint="eastAsia"/>
-          <w:b w:val="0"/>
-          <w:bCs w:val="0"/>
-          <w:lang w:val="en-US" w:eastAsia="zh-CN"/>
-        </w:rPr>
-      </w:pPr>
-    </w:p>
-    <w:p>
-      <w:pPr>
-        <w:numPr>
-          <w:ilvl w:val="0"/>
-          <w:numId w:val="0"/>
-        </w:numPr>
-        <w:ind w:leftChars="0"/>
-        <w:rPr>
-          <w:rFonts w:hint="eastAsia"/>
-          <w:b w:val="0"/>
-          <w:bCs w:val="0"/>
-          <w:lang w:val="en-US" w:eastAsia="zh-CN"/>
-        </w:rPr>
-      </w:pPr>
-    </w:p>
-    <w:p>
-      <w:pPr>
-        <w:numPr>
-          <w:ilvl w:val="0"/>
-          <w:numId w:val="0"/>
-        </w:numPr>
-        <w:ind w:leftChars="0"/>
-        <w:rPr>
-          <w:rFonts w:hint="eastAsia"/>
-          <w:b w:val="0"/>
-          <w:bCs w:val="0"/>
-          <w:lang w:val="en-US" w:eastAsia="zh-CN"/>
-        </w:rPr>
-      </w:pPr>
-    </w:p>
-    <w:p>
-      <w:pPr>
-        <w:numPr>
-          <w:ilvl w:val="0"/>
-          <w:numId w:val="0"/>
-        </w:numPr>
-        <w:ind w:leftChars="0"/>
-        <w:rPr>
-          <w:rFonts w:hint="eastAsia"/>
-          <w:b w:val="0"/>
-          <w:bCs w:val="0"/>
-          <w:lang w:val="en-US" w:eastAsia="zh-CN"/>
-        </w:rPr>
-      </w:pPr>
-    </w:p>
-    <w:p>
-      <w:pPr>
-        <w:numPr>
-          <w:ilvl w:val="0"/>
-          <w:numId w:val="0"/>
-        </w:numPr>
-        <w:ind w:leftChars="0"/>
-        <w:rPr>
-          <w:rFonts w:hint="eastAsia"/>
-          <w:b w:val="0"/>
-          <w:bCs w:val="0"/>
-          <w:lang w:val="en-US" w:eastAsia="zh-CN"/>
-        </w:rPr>
-      </w:pPr>
-    </w:p>
-    <w:p>
-      <w:pPr>
-        <w:numPr>
-          <w:ilvl w:val="0"/>
-          <w:numId w:val="0"/>
-        </w:numPr>
-        <w:ind w:leftChars="0"/>
-        <w:rPr>
-          <w:rFonts w:hint="eastAsia"/>
-          <w:b w:val="0"/>
-          <w:bCs w:val="0"/>
-          <w:lang w:val="en-US" w:eastAsia="zh-CN"/>
-        </w:rPr>
-      </w:pPr>
-    </w:p>
-    <w:p>
-      <w:pPr>
-        <w:numPr>
-          <w:ilvl w:val="0"/>
-          <w:numId w:val="0"/>
-        </w:numPr>
-        <w:ind w:leftChars="0"/>
-        <w:rPr>
-          <w:rFonts w:hint="eastAsia"/>
-          <w:b w:val="0"/>
-          <w:bCs w:val="0"/>
-          <w:lang w:val="en-US" w:eastAsia="zh-CN"/>
-        </w:rPr>
-      </w:pPr>
-    </w:p>
-    <w:p>
-      <w:pPr>
-        <w:numPr>
-          <w:ilvl w:val="0"/>
-          <w:numId w:val="0"/>
-        </w:numPr>
-        <w:ind w:leftChars="0"/>
-        <w:rPr>
-          <w:rFonts w:hint="eastAsia"/>
-          <w:b w:val="0"/>
-          <w:bCs w:val="0"/>
-          <w:lang w:val="en-US" w:eastAsia="zh-CN"/>
-        </w:rPr>
-      </w:pPr>
-    </w:p>
-    <w:p>
-      <w:pPr>
-        <w:numPr>
-          <w:ilvl w:val="0"/>
-          <w:numId w:val="0"/>
-        </w:numPr>
-        <w:ind w:leftChars="0"/>
-        <w:rPr>
-          <w:rFonts w:hint="default"/>
-          <w:b w:val="0"/>
-          <w:bCs w:val="0"/>
-          <w:lang w:val="en-US" w:eastAsia="zh-CN"/>
-        </w:rPr>
-      </w:pPr>
-      <w:r>
-        <w:rPr>
-          <w:rFonts w:hint="eastAsia"/>
-          <w:b w:val="0"/>
-          <w:bCs w:val="0"/>
-          <w:lang w:val="en-US" w:eastAsia="zh-CN"/>
-        </w:rPr>
-        <w:t>战斗界面示意图</w:t>
-      </w:r>
-    </w:p>
-    <w:p>
-      <w:pPr>
-        <w:numPr>
-          <w:ilvl w:val="0"/>
-          <w:numId w:val="0"/>
-        </w:numPr>
-        <w:ind w:leftChars="0"/>
-        <w:rPr>
-          <w:rFonts w:hint="default"/>
-          <w:b w:val="0"/>
-          <w:bCs w:val="0"/>
-          <w:lang w:val="en-US" w:eastAsia="zh-CN"/>
-        </w:rPr>
-      </w:pPr>
-      <w:r>
-        <w:rPr>
-          <w:rFonts w:hint="default"/>
-          <w:b w:val="0"/>
-          <w:bCs w:val="0"/>
-          <w:lang w:val="en-US" w:eastAsia="zh-CN"/>
-        </w:rPr>
-        <w:drawing>
-          <wp:inline distT="0" distB="0" distL="114300" distR="114300">
-            <wp:extent cx="5257800" cy="2844165"/>
-            <wp:effectExtent l="0" t="0" r="0" b="635"/>
-            <wp:docPr id="13" name="图片 2"/>
-            <wp:cNvGraphicFramePr>
-              <a:graphicFrameLocks xmlns:a="http://schemas.openxmlformats.org/drawingml/2006/main" noChangeAspect="1"/>
-            </wp:cNvGraphicFramePr>
-            <a:graphic xmlns:a="http://schemas.openxmlformats.org/drawingml/2006/main">
-              <a:graphicData uri="http://schemas.openxmlformats.org/drawingml/2006/picture">
-                <pic:pic xmlns:pic="http://schemas.openxmlformats.org/drawingml/2006/picture">
-                  <pic:nvPicPr>
-                    <pic:cNvPr id="13" name="图片 2"/>
-                    <pic:cNvPicPr>
-                      <a:picLocks noChangeAspect="1"/>
-                    </pic:cNvPicPr>
-                  </pic:nvPicPr>
-                  <pic:blipFill>
-                    <a:blip r:embed="rId15"/>
-                    <a:stretch>
-                      <a:fillRect/>
-                    </a:stretch>
-                  </pic:blipFill>
-                  <pic:spPr>
-                    <a:xfrm>
-                      <a:off x="0" y="0"/>
-                      <a:ext cx="5257800" cy="2844165"/>
-                    </a:xfrm>
-                    <a:prstGeom prst="rect">
-                      <a:avLst/>
-                    </a:prstGeom>
-                    <a:noFill/>
-                    <a:ln>
-                      <a:noFill/>
-                    </a:ln>
-                  </pic:spPr>
-                </pic:pic>
-              </a:graphicData>
-            </a:graphic>
-          </wp:inline>
-        </w:drawing>
-      </w:r>
-    </w:p>
-    <w:p>
-      <w:pPr>
-        <w:numPr>
-          <w:ilvl w:val="0"/>
-          <w:numId w:val="4"/>
-        </w:numPr>
-        <w:ind w:leftChars="0"/>
-        <w:rPr>
-          <w:rFonts w:hint="eastAsia"/>
-          <w:b w:val="0"/>
-          <w:bCs w:val="0"/>
-          <w:lang w:val="en-US" w:eastAsia="zh-CN"/>
-        </w:rPr>
-      </w:pPr>
-      <w:r>
-        <w:rPr>
-          <w:rFonts w:hint="eastAsia"/>
-          <w:b w:val="0"/>
-          <w:bCs w:val="0"/>
-          <w:lang w:val="en-US" w:eastAsia="zh-CN"/>
-        </w:rPr>
-        <w:t>手中零件不能组装出某一建筑时，该建筑图标置灰，若能，建筑图标置亮</w:t>
-      </w:r>
-    </w:p>
-    <w:p>
-      <w:pPr>
-        <w:numPr>
-          <w:ilvl w:val="0"/>
-          <w:numId w:val="4"/>
-        </w:numPr>
-        <w:ind w:leftChars="0"/>
-        <w:rPr>
-          <w:rFonts w:hint="default"/>
-          <w:b w:val="0"/>
-          <w:bCs w:val="0"/>
-          <w:lang w:val="en-US" w:eastAsia="zh-CN"/>
-        </w:rPr>
-      </w:pPr>
-      <w:r>
-        <w:rPr>
-          <w:rFonts w:hint="eastAsia"/>
-          <w:b w:val="0"/>
-          <w:bCs w:val="0"/>
-          <w:lang w:val="en-US" w:eastAsia="zh-CN"/>
-        </w:rPr>
-        <w:t>wasd或鼠标拖动可移动视角</w:t>
-      </w:r>
-    </w:p>
-    <w:p>
-      <w:pPr>
-        <w:numPr>
-          <w:ilvl w:val="0"/>
-          <w:numId w:val="4"/>
-        </w:numPr>
-        <w:ind w:leftChars="0"/>
-        <w:rPr>
-          <w:rFonts w:hint="default"/>
-          <w:b w:val="0"/>
-          <w:bCs w:val="0"/>
-          <w:lang w:val="en-US" w:eastAsia="zh-CN"/>
-        </w:rPr>
-      </w:pPr>
-      <w:r>
-        <w:rPr>
-          <w:rFonts w:hint="eastAsia"/>
-          <w:b w:val="0"/>
-          <w:bCs w:val="0"/>
-          <w:lang w:val="en-US" w:eastAsia="zh-CN"/>
-        </w:rPr>
-        <w:t>当前拥有的金币不够购买某商品时，该商品图标置灰，若足够，商品图标置亮</w:t>
-      </w:r>
-    </w:p>
-    <w:p>
-      <w:pPr>
-        <w:numPr>
-          <w:ilvl w:val="0"/>
-          <w:numId w:val="4"/>
-        </w:numPr>
-        <w:ind w:leftChars="0"/>
-        <w:rPr>
-          <w:rFonts w:hint="default"/>
-          <w:b w:val="0"/>
-          <w:bCs w:val="0"/>
-          <w:lang w:val="en-US" w:eastAsia="zh-CN"/>
-        </w:rPr>
-      </w:pPr>
-      <w:r>
-        <w:rPr>
-          <w:rFonts w:hint="eastAsia"/>
-          <w:b w:val="0"/>
-          <w:bCs w:val="0"/>
-          <w:lang w:val="en-US" w:eastAsia="zh-CN"/>
-        </w:rPr>
-        <w:t>拥有玩具盒数量不为0时点击玩具盒图标使用玩具盒，使用效果为获取该玩具盒可开出零件，当前拥有的零件显示在零件图标位置</w:t>
-      </w:r>
-    </w:p>
-    <w:p>
-      <w:pPr>
-        <w:numPr>
-          <w:numId w:val="0"/>
-        </w:numPr>
-        <w:rPr>
-          <w:rFonts w:hint="eastAsia"/>
-          <w:b w:val="0"/>
-          <w:bCs w:val="0"/>
-          <w:lang w:val="en-US" w:eastAsia="zh-CN"/>
-        </w:rPr>
-      </w:pPr>
-    </w:p>
-    <w:p>
-      <w:pPr>
-        <w:numPr>
-          <w:numId w:val="0"/>
-        </w:numPr>
-        <w:rPr>
-          <w:rFonts w:hint="eastAsia"/>
-          <w:b w:val="0"/>
-          <w:bCs w:val="0"/>
-          <w:lang w:val="en-US" w:eastAsia="zh-CN"/>
-        </w:rPr>
-      </w:pPr>
-      <w:r>
-        <w:rPr>
-          <w:rFonts w:hint="eastAsia"/>
-          <w:b w:val="0"/>
-          <w:bCs w:val="0"/>
-          <w:lang w:val="en-US" w:eastAsia="zh-CN"/>
-        </w:rPr>
-        <w:t>商店商品：</w:t>
-      </w:r>
-    </w:p>
-    <w:p>
-      <w:pPr>
-        <w:numPr>
-          <w:ilvl w:val="0"/>
-          <w:numId w:val="5"/>
-        </w:numPr>
-        <w:rPr>
-          <w:rFonts w:hint="eastAsia"/>
-          <w:b w:val="0"/>
-          <w:bCs w:val="0"/>
-          <w:lang w:val="en-US" w:eastAsia="zh-CN"/>
-        </w:rPr>
-      </w:pPr>
-      <w:r>
-        <w:rPr>
-          <w:rFonts w:hint="eastAsia"/>
-          <w:b w:val="0"/>
-          <w:bCs w:val="0"/>
-          <w:lang w:val="en-US" w:eastAsia="zh-CN"/>
-        </w:rPr>
-        <w:t>可搭建建筑数量上限提高1</w:t>
-      </w:r>
-    </w:p>
-    <w:p>
-      <w:pPr>
-        <w:numPr>
-          <w:ilvl w:val="0"/>
-          <w:numId w:val="5"/>
-        </w:numPr>
-        <w:rPr>
-          <w:rFonts w:hint="default"/>
-          <w:b w:val="0"/>
-          <w:bCs w:val="0"/>
-          <w:lang w:val="en-US" w:eastAsia="zh-CN"/>
-        </w:rPr>
-      </w:pPr>
-      <w:r>
-        <w:rPr>
-          <w:rFonts w:hint="eastAsia"/>
-          <w:b w:val="0"/>
-          <w:bCs w:val="0"/>
-          <w:lang w:val="en-US" w:eastAsia="zh-CN"/>
-        </w:rPr>
-        <w:t>当前玩具盒数量加1</w:t>
-      </w:r>
-    </w:p>
-    <w:p>
-      <w:pPr>
-        <w:numPr>
-          <w:ilvl w:val="0"/>
-          <w:numId w:val="5"/>
-        </w:numPr>
-        <w:rPr>
-          <w:rFonts w:hint="default"/>
-          <w:b w:val="0"/>
-          <w:bCs w:val="0"/>
-          <w:lang w:val="en-US" w:eastAsia="zh-CN"/>
-        </w:rPr>
-      </w:pPr>
-      <w:r>
-        <w:rPr>
-          <w:rFonts w:hint="eastAsia"/>
-          <w:b w:val="0"/>
-          <w:bCs w:val="0"/>
-          <w:lang w:val="en-US" w:eastAsia="zh-CN"/>
-        </w:rPr>
-        <w:t>等级加1</w:t>
-      </w:r>
-    </w:p>
-    <w:p>
-      <w:pPr>
-        <w:widowControl w:val="0"/>
-        <w:numPr>
-          <w:numId w:val="0"/>
-        </w:numPr>
-        <w:jc w:val="both"/>
-        <w:rPr>
-          <w:rFonts w:hint="eastAsia"/>
-          <w:b w:val="0"/>
-          <w:bCs w:val="0"/>
-          <w:lang w:val="en-US" w:eastAsia="zh-CN"/>
-        </w:rPr>
-      </w:pPr>
-    </w:p>
-    <w:p>
-      <w:pPr>
-        <w:widowControl w:val="0"/>
-        <w:numPr>
-          <w:numId w:val="0"/>
-        </w:numPr>
-        <w:jc w:val="both"/>
-        <w:rPr>
-          <w:rFonts w:hint="eastAsia"/>
-          <w:b w:val="0"/>
-          <w:bCs w:val="0"/>
-          <w:lang w:val="en-US" w:eastAsia="zh-CN"/>
-        </w:rPr>
-      </w:pPr>
-      <w:r>
-        <w:rPr>
-          <w:rFonts w:hint="eastAsia"/>
-          <w:b w:val="0"/>
-          <w:bCs w:val="0"/>
-          <w:lang w:val="en-US" w:eastAsia="zh-CN"/>
-        </w:rPr>
-        <w:t>搭建建筑机制：</w:t>
-      </w:r>
-    </w:p>
-    <w:p>
-      <w:pPr>
-        <w:widowControl w:val="0"/>
-        <w:numPr>
-          <w:numId w:val="0"/>
-        </w:numPr>
-        <w:jc w:val="both"/>
-        <w:rPr>
-          <w:rFonts w:hint="default"/>
-          <w:b w:val="0"/>
-          <w:bCs w:val="0"/>
-          <w:lang w:val="en-US" w:eastAsia="zh-CN"/>
-        </w:rPr>
-      </w:pPr>
-      <w:r>
-        <w:rPr>
-          <w:rFonts w:hint="eastAsia"/>
-          <w:b w:val="0"/>
-          <w:bCs w:val="0"/>
-          <w:lang w:val="en-US" w:eastAsia="zh-CN"/>
-        </w:rPr>
-        <w:t>拥有对应图纸所需零件后，点击选中战斗界面对应建筑图标，再点击战斗场地任一位置可搭建建筑，当建筑数量达上限后无法进行搭建，表现为无法选中建筑图标</w:t>
-      </w:r>
-    </w:p>
-    <w:p>
-      <w:pPr>
-        <w:widowControl w:val="0"/>
-        <w:numPr>
-          <w:numId w:val="0"/>
-        </w:numPr>
-        <w:jc w:val="both"/>
-        <w:rPr>
-          <w:rFonts w:hint="eastAsia"/>
-          <w:b w:val="0"/>
-          <w:bCs w:val="0"/>
-          <w:lang w:val="en-US" w:eastAsia="zh-CN"/>
-        </w:rPr>
-      </w:pPr>
-    </w:p>
-    <w:p>
-      <w:pPr>
-        <w:widowControl w:val="0"/>
-        <w:numPr>
-          <w:numId w:val="0"/>
-        </w:numPr>
-        <w:jc w:val="both"/>
-        <w:rPr>
-          <w:rFonts w:hint="eastAsia"/>
-          <w:b w:val="0"/>
-          <w:bCs w:val="0"/>
-          <w:lang w:val="en-US" w:eastAsia="zh-CN"/>
-        </w:rPr>
-      </w:pPr>
-      <w:r>
-        <w:rPr>
-          <w:rFonts w:hint="eastAsia"/>
-          <w:b w:val="0"/>
-          <w:bCs w:val="0"/>
-          <w:lang w:val="en-US" w:eastAsia="zh-CN"/>
-        </w:rPr>
-        <w:t>建筑升级机制：</w:t>
-      </w:r>
-    </w:p>
-    <w:p>
-      <w:pPr>
-        <w:widowControl w:val="0"/>
-        <w:numPr>
-          <w:numId w:val="0"/>
-        </w:numPr>
-        <w:jc w:val="both"/>
-        <w:rPr>
-          <w:rFonts w:hint="eastAsia"/>
-          <w:b w:val="0"/>
-          <w:bCs w:val="0"/>
-          <w:lang w:val="en-US" w:eastAsia="zh-CN"/>
-        </w:rPr>
-      </w:pPr>
-      <w:r>
-        <w:rPr>
-          <w:rFonts w:hint="eastAsia"/>
-          <w:b w:val="0"/>
-          <w:bCs w:val="0"/>
-          <w:lang w:val="en-US" w:eastAsia="zh-CN"/>
-        </w:rPr>
-        <w:t>使用零件组装出建筑后，拖动零件至建筑上可消耗零件升级建筑，不同零件有不同升级效果，升级1次建筑视为原有等级加1，建筑等级不能超过现等级上限，商店购买等级可提升等级</w:t>
-      </w:r>
-    </w:p>
-    <w:p>
-      <w:pPr>
-        <w:widowControl w:val="0"/>
-        <w:numPr>
-          <w:numId w:val="0"/>
-        </w:numPr>
-        <w:jc w:val="both"/>
-        <w:rPr>
-          <w:rFonts w:hint="eastAsia"/>
-          <w:b w:val="0"/>
-          <w:bCs w:val="0"/>
-          <w:lang w:val="en-US" w:eastAsia="zh-CN"/>
-        </w:rPr>
-      </w:pPr>
-    </w:p>
-    <w:p>
-      <w:pPr>
-        <w:widowControl w:val="0"/>
-        <w:numPr>
-          <w:numId w:val="0"/>
-        </w:numPr>
-        <w:jc w:val="both"/>
-        <w:rPr>
-          <w:rFonts w:hint="eastAsia"/>
-          <w:b w:val="0"/>
-          <w:bCs w:val="0"/>
-          <w:lang w:val="en-US" w:eastAsia="zh-CN"/>
-        </w:rPr>
-      </w:pPr>
-      <w:r>
-        <w:rPr>
-          <w:rFonts w:hint="eastAsia"/>
-          <w:b w:val="0"/>
-          <w:bCs w:val="0"/>
-          <w:lang w:val="en-US" w:eastAsia="zh-CN"/>
-        </w:rPr>
-        <w:t>场地中建筑详情：</w:t>
-      </w:r>
-    </w:p>
-    <w:p>
-      <w:pPr>
-        <w:widowControl w:val="0"/>
-        <w:numPr>
-          <w:numId w:val="0"/>
-        </w:numPr>
-        <w:jc w:val="both"/>
-        <w:rPr>
-          <w:rFonts w:hint="eastAsia"/>
-          <w:b w:val="0"/>
-          <w:bCs w:val="0"/>
-          <w:lang w:val="en-US" w:eastAsia="zh-CN"/>
-        </w:rPr>
-      </w:pPr>
-      <w:r>
-        <w:rPr>
-          <w:rFonts w:hint="eastAsia"/>
-          <w:b w:val="0"/>
-          <w:bCs w:val="0"/>
-          <w:lang w:val="en-US" w:eastAsia="zh-CN"/>
-        </w:rPr>
-        <w:t>点击建筑可显示出对应建筑信息，界面如下：</w:t>
-      </w:r>
-    </w:p>
-    <w:p>
-      <w:pPr>
-        <w:widowControl w:val="0"/>
-        <w:numPr>
-          <w:numId w:val="0"/>
-        </w:numPr>
-        <w:jc w:val="both"/>
-        <w:rPr>
-          <w:rFonts w:hint="default"/>
-          <w:b w:val="0"/>
-          <w:bCs w:val="0"/>
-          <w:lang w:val="en-US" w:eastAsia="zh-CN"/>
-        </w:rPr>
-      </w:pPr>
-      <w:r>
-        <w:rPr>
-          <w:rFonts w:hint="default"/>
-          <w:b w:val="0"/>
-          <w:bCs w:val="0"/>
-          <w:lang w:val="en-US" w:eastAsia="zh-CN"/>
-        </w:rPr>
-        <w:drawing>
-          <wp:inline distT="0" distB="0" distL="114300" distR="114300">
-            <wp:extent cx="1677035" cy="1414145"/>
-            <wp:effectExtent l="0" t="0" r="12065" b="8255"/>
-            <wp:docPr id="14" name="图片 3"/>
-            <wp:cNvGraphicFramePr>
-              <a:graphicFrameLocks xmlns:a="http://schemas.openxmlformats.org/drawingml/2006/main" noChangeAspect="1"/>
-            </wp:cNvGraphicFramePr>
-            <a:graphic xmlns:a="http://schemas.openxmlformats.org/drawingml/2006/main">
-              <a:graphicData uri="http://schemas.openxmlformats.org/drawingml/2006/picture">
-                <pic:pic xmlns:pic="http://schemas.openxmlformats.org/drawingml/2006/picture">
-                  <pic:nvPicPr>
-                    <pic:cNvPr id="14" name="图片 3"/>
-                    <pic:cNvPicPr>
-                      <a:picLocks noChangeAspect="1"/>
-                    </pic:cNvPicPr>
-                  </pic:nvPicPr>
-                  <pic:blipFill>
-                    <a:blip r:embed="rId16"/>
-                    <a:stretch>
-                      <a:fillRect/>
-                    </a:stretch>
-                  </pic:blipFill>
-                  <pic:spPr>
-                    <a:xfrm>
-                      <a:off x="0" y="0"/>
-                      <a:ext cx="1677035" cy="1414145"/>
-                    </a:xfrm>
-                    <a:prstGeom prst="rect">
-                      <a:avLst/>
-                    </a:prstGeom>
-                    <a:noFill/>
-                    <a:ln>
-                      <a:noFill/>
-                    </a:ln>
-                  </pic:spPr>
-                </pic:pic>
-              </a:graphicData>
-            </a:graphic>
-          </wp:inline>
-        </w:drawing>
-      </w:r>
-    </w:p>
-    <w:p>
-      <w:pPr>
-        <w:widowControl w:val="0"/>
-        <w:numPr>
-          <w:numId w:val="0"/>
-        </w:numPr>
-        <w:jc w:val="both"/>
-        <w:rPr>
-          <w:rFonts w:hint="default"/>
-          <w:b w:val="0"/>
-          <w:bCs w:val="0"/>
-          <w:lang w:val="en-US" w:eastAsia="zh-CN"/>
-        </w:rPr>
-      </w:pPr>
-      <w:r>
-        <w:rPr>
-          <w:rFonts w:hint="eastAsia"/>
-          <w:b w:val="0"/>
-          <w:bCs w:val="0"/>
-          <w:lang w:val="en-US" w:eastAsia="zh-CN"/>
-        </w:rPr>
-        <w:t>出售建筑可回收组建建筑使用的零件，无法获得升级建筑使用的零件</w:t>
       </w:r>
       <w:bookmarkStart w:id="0" w:name="_GoBack"/>
       <w:bookmarkEnd w:id="0"/>
+    </w:p>
+    <w:p>
+      <w:pPr>
+        <w:numPr>
+          <w:numId w:val="0"/>
+        </w:numPr>
+        <w:ind w:leftChars="0"/>
+        <w:rPr>
+          <w:rFonts w:hint="default"/>
+          <w:b w:val="0"/>
+          <w:bCs w:val="0"/>
+          <w:lang w:val="en-US" w:eastAsia="zh-CN"/>
+        </w:rPr>
+      </w:pPr>
+      <w:r>
+        <w:rPr>
+          <w:rFonts w:hint="eastAsia"/>
+          <w:b w:val="0"/>
+          <w:bCs w:val="0"/>
+          <w:lang w:val="en-US" w:eastAsia="zh-CN"/>
+        </w:rPr>
+        <w:t>通关：当前波次数与总波次数相同且波次倒计时结束后所有怪物都被消灭，弹出战斗胜利字样，5秒后关闭战斗界面至选关界面</w:t>
+      </w:r>
     </w:p>
     <w:sectPr>
       <w:pgSz w:w="11906" w:h="16838"/>
@@ -2287,22 +1575,6 @@
     </w:lvl>
   </w:abstractNum>
   <w:abstractNum w:abstractNumId="1">
-    <w:nsid w:val="13A220A1"/>
-    <w:multiLevelType w:val="singleLevel"/>
-    <w:tmpl w:val="13A220A1"/>
-    <w:lvl w:ilvl="0" w:tentative="0">
-      <w:start w:val="1"/>
-      <w:numFmt w:val="decimal"/>
-      <w:lvlText w:val="%1."/>
-      <w:lvlJc w:val="left"/>
-      <w:pPr>
-        <w:tabs>
-          <w:tab w:val="left" w:pos="312"/>
-        </w:tabs>
-      </w:pPr>
-    </w:lvl>
-  </w:abstractNum>
-  <w:abstractNum w:abstractNumId="2">
     <w:nsid w:val="1BE64581"/>
     <w:multiLevelType w:val="singleLevel"/>
     <w:tmpl w:val="1BE64581"/>
@@ -2317,23 +1589,7 @@
       </w:rPr>
     </w:lvl>
   </w:abstractNum>
-  <w:abstractNum w:abstractNumId="3">
-    <w:nsid w:val="4976F58B"/>
-    <w:multiLevelType w:val="singleLevel"/>
-    <w:tmpl w:val="4976F58B"/>
-    <w:lvl w:ilvl="0" w:tentative="0">
-      <w:start w:val="1"/>
-      <w:numFmt w:val="decimal"/>
-      <w:lvlText w:val="%1."/>
-      <w:lvlJc w:val="left"/>
-      <w:pPr>
-        <w:tabs>
-          <w:tab w:val="left" w:pos="312"/>
-        </w:tabs>
-      </w:pPr>
-    </w:lvl>
-  </w:abstractNum>
-  <w:abstractNum w:abstractNumId="4">
+  <w:abstractNum w:abstractNumId="2">
     <w:nsid w:val="67B42D84"/>
     <w:multiLevelType w:val="singleLevel"/>
     <w:tmpl w:val="67B42D84"/>
@@ -2350,19 +1606,13 @@
     </w:lvl>
   </w:abstractNum>
   <w:num w:numId="1">
-    <w:abstractNumId w:val="2"/>
+    <w:abstractNumId w:val="1"/>
   </w:num>
   <w:num w:numId="2">
     <w:abstractNumId w:val="0"/>
   </w:num>
   <w:num w:numId="3">
-    <w:abstractNumId w:val="4"/>
-  </w:num>
-  <w:num w:numId="4">
-    <w:abstractNumId w:val="3"/>
-  </w:num>
-  <w:num w:numId="5">
-    <w:abstractNumId w:val="1"/>
+    <w:abstractNumId w:val="2"/>
   </w:num>
 </w:numbering>
 </file>

</xml_diff>